<commit_message>
feat: enhance photo upload UI, smooth signature pad, fix dashboard district, separate camera states
</commit_message>
<xml_diff>
--- a/src/templates/4. NET_METERING_CONNECTION_AGREEMENT.docx
+++ b/src/templates/4. NET_METERING_CONNECTION_AGREEMENT.docx
@@ -5,47 +5,14 @@
     <w:p>
       <w:pPr>
         <w:spacing w:after="0" w:line="259" w:lineRule="auto"/>
-        <w:ind w:left="10" w:right="48" w:hanging="10"/>
+        <w:ind w:left="0" w:right="48" w:firstLine="0"/>
         <w:jc w:val="center"/>
+      </w:pPr>
+      <w:r>
         <w:rPr>
           <w:b/>
         </w:rPr>
-      </w:pPr>
-    </w:p>
-    <w:p>
-      <w:pPr>
-        <w:spacing w:after="0" w:line="259" w:lineRule="auto"/>
-        <w:ind w:left="10" w:right="48" w:hanging="10"/>
-        <w:jc w:val="center"/>
-        <w:rPr>
-          <w:b/>
-        </w:rPr>
-      </w:pPr>
-    </w:p>
-    <w:p>
-      <w:pPr>
-        <w:spacing w:after="0" w:line="259" w:lineRule="auto"/>
-        <w:ind w:left="10" w:right="48" w:hanging="10"/>
-        <w:jc w:val="center"/>
-        <w:rPr>
-          <w:b/>
-        </w:rPr>
-      </w:pPr>
-    </w:p>
-    <w:p>
-      <w:pPr>
-        <w:spacing w:after="0" w:line="259" w:lineRule="auto"/>
-        <w:ind w:left="10" w:right="48" w:hanging="10"/>
-        <w:jc w:val="center"/>
-      </w:pPr>
-      <w:r>
-        <w:rPr>
-          <w:b/>
-        </w:rPr>
         <w:t>Annexure – 3</w:t>
-      </w:r>
-      <w:r>
-        <w:t xml:space="preserve"> </w:t>
       </w:r>
     </w:p>
     <w:p>
@@ -98,22 +65,54 @@
         <w:t xml:space="preserve">This Agreement is made and entered into at </w:t>
       </w:r>
       <w:r>
-        <w:t xml:space="preserve">  MALEGAON </w:t>
-      </w:r>
-      <w:r>
-        <w:t xml:space="preserve"> on this </w:t>
-      </w:r>
-      <w:r>
-        <w:t xml:space="preserve"> </w:t>
-      </w:r>
-      <w:r>
-        <w:t>{{agreement_date}}</w:t>
+        <w:t xml:space="preserve">  </w:t>
+      </w:r>
+      <w:proofErr w:type="gramStart"/>
+      <w:r>
+        <w:t xml:space="preserve">MALEGAON </w:t>
+      </w:r>
+      <w:r>
+        <w:t xml:space="preserve"> on</w:t>
+      </w:r>
+      <w:proofErr w:type="gramEnd"/>
+      <w:r>
+        <w:t xml:space="preserve"> </w:t>
+      </w:r>
+      <w:proofErr w:type="gramStart"/>
+      <w:r>
+        <w:t xml:space="preserve">this </w:t>
+      </w:r>
+      <w:r>
+        <w:t xml:space="preserve"> </w:t>
+      </w:r>
+      <w:r>
+        <w:t>{</w:t>
+      </w:r>
+      <w:proofErr w:type="gramEnd"/>
+      <w:r>
+        <w:t>{</w:t>
+      </w:r>
+      <w:proofErr w:type="spellStart"/>
+      <w:r>
+        <w:t>agreement_date</w:t>
+      </w:r>
+      <w:proofErr w:type="spellEnd"/>
+      <w:r>
+        <w:t>}}</w:t>
       </w:r>
       <w:r>
         <w:t xml:space="preserve"> between the Eligible </w:t>
       </w:r>
       <w:r>
-        <w:t>{{consumer_name}}</w:t>
+        <w:t>{{</w:t>
+      </w:r>
+      <w:proofErr w:type="spellStart"/>
+      <w:r>
+        <w:t>consumer_name</w:t>
+      </w:r>
+      <w:proofErr w:type="spellEnd"/>
+      <w:r>
+        <w:t>}}</w:t>
       </w:r>
       <w:r>
         <w:t xml:space="preserve"> having premises at </w:t>
@@ -131,7 +130,15 @@
         <w:t xml:space="preserve"> </w:t>
       </w:r>
       <w:r>
-        <w:t xml:space="preserve">{{consumer_number}} </w:t>
+        <w:t>{{</w:t>
+      </w:r>
+      <w:proofErr w:type="spellStart"/>
+      <w:r>
+        <w:t>consumer_number</w:t>
+      </w:r>
+      <w:proofErr w:type="spellEnd"/>
+      <w:r>
+        <w:t xml:space="preserve">}} </w:t>
       </w:r>
       <w:r>
         <w:t xml:space="preserve">as the first Party,  </w:t>
@@ -190,11 +197,16 @@
       <w:r>
         <w:t xml:space="preserve">; and having its Registered Office at </w:t>
       </w:r>
+      <w:proofErr w:type="gramStart"/>
       <w:r>
         <w:t xml:space="preserve">MALEGAON  </w:t>
       </w:r>
       <w:r>
-        <w:t xml:space="preserve">as second Party of this Agreement. </w:t>
+        <w:t>as</w:t>
+      </w:r>
+      <w:proofErr w:type="gramEnd"/>
+      <w:r>
+        <w:t xml:space="preserve"> second Party of this Agreement. </w:t>
       </w:r>
     </w:p>
     <w:p>
@@ -280,7 +292,55 @@
         </w:rPr>
       </w:pPr>
       <w:r>
-        <w:t xml:space="preserve">And whereas MSEDCL has agreed to provide Network connectivity to the Eligible Consumer for  injection  of  electricity  generated  from  its  Renewable  Energy  Generating  System  of </w:t>
+        <w:t xml:space="preserve">And whereas MSEDCL has agreed to provide Network connectivity to the Eligible Consumer </w:t>
+      </w:r>
+      <w:proofErr w:type="gramStart"/>
+      <w:r>
+        <w:t>for  injection</w:t>
+      </w:r>
+      <w:proofErr w:type="gramEnd"/>
+      <w:r>
+        <w:t xml:space="preserve">  </w:t>
+      </w:r>
+      <w:proofErr w:type="gramStart"/>
+      <w:r>
+        <w:t>of  electricity</w:t>
+      </w:r>
+      <w:proofErr w:type="gramEnd"/>
+      <w:r>
+        <w:t xml:space="preserve">  </w:t>
+      </w:r>
+      <w:proofErr w:type="gramStart"/>
+      <w:r>
+        <w:t>generated  from</w:t>
+      </w:r>
+      <w:proofErr w:type="gramEnd"/>
+      <w:r>
+        <w:t xml:space="preserve">  </w:t>
+      </w:r>
+      <w:proofErr w:type="gramStart"/>
+      <w:r>
+        <w:t>its  Renewable</w:t>
+      </w:r>
+      <w:proofErr w:type="gramEnd"/>
+      <w:r>
+        <w:t xml:space="preserve">  </w:t>
+      </w:r>
+      <w:proofErr w:type="gramStart"/>
+      <w:r>
+        <w:t>Energy  Generating</w:t>
+      </w:r>
+      <w:proofErr w:type="gramEnd"/>
+      <w:r>
+        <w:t xml:space="preserve">  </w:t>
+      </w:r>
+      <w:proofErr w:type="gramStart"/>
+      <w:r>
+        <w:t>System  of</w:t>
+      </w:r>
+      <w:proofErr w:type="gramEnd"/>
+      <w:r>
+        <w:t xml:space="preserve"> </w:t>
       </w:r>
       <w:r>
         <w:rPr>
@@ -767,7 +827,15 @@
         <w:ind w:right="14" w:hanging="576"/>
       </w:pPr>
       <w:r>
-        <w:t xml:space="preserve">This Agreement shall be for a period for 20 years, but may be terminated prematurely a)  By mutual consent; or </w:t>
+        <w:t xml:space="preserve">This Agreement shall be for a period for 20 years, but may be terminated prematurely </w:t>
+      </w:r>
+      <w:proofErr w:type="gramStart"/>
+      <w:r>
+        <w:t>a)  By</w:t>
+      </w:r>
+      <w:proofErr w:type="gramEnd"/>
+      <w:r>
+        <w:t xml:space="preserve"> mutual consent; or </w:t>
       </w:r>
     </w:p>
     <w:p>
@@ -929,8 +997,45 @@
         </w:numPr>
         <w:ind w:right="14" w:hanging="576"/>
       </w:pPr>
-      <w:r>
-        <w:t xml:space="preserve">Upon  termination  of  this  Agreement  under  Clause  5,  the  Eligible  Consumer  shall disconnect the Renewable Energy Generating System forthwith from the Network of MSEDCL. </w:t>
+      <w:proofErr w:type="gramStart"/>
+      <w:r>
+        <w:t>Upon  termination</w:t>
+      </w:r>
+      <w:proofErr w:type="gramEnd"/>
+      <w:r>
+        <w:t xml:space="preserve">  </w:t>
+      </w:r>
+      <w:proofErr w:type="gramStart"/>
+      <w:r>
+        <w:t>of  this</w:t>
+      </w:r>
+      <w:proofErr w:type="gramEnd"/>
+      <w:r>
+        <w:t xml:space="preserve">  </w:t>
+      </w:r>
+      <w:proofErr w:type="gramStart"/>
+      <w:r>
+        <w:t>Agreement  under</w:t>
+      </w:r>
+      <w:proofErr w:type="gramEnd"/>
+      <w:r>
+        <w:t xml:space="preserve">  </w:t>
+      </w:r>
+      <w:proofErr w:type="gramStart"/>
+      <w:r>
+        <w:t>Clause  5,  the</w:t>
+      </w:r>
+      <w:proofErr w:type="gramEnd"/>
+      <w:r>
+        <w:t xml:space="preserve">  </w:t>
+      </w:r>
+      <w:proofErr w:type="gramStart"/>
+      <w:r>
+        <w:t>Eligible  Consumer</w:t>
+      </w:r>
+      <w:proofErr w:type="gramEnd"/>
+      <w:r>
+        <w:t xml:space="preserve">  shall disconnect the Renewable Energy Generating System forthwith from the Network of MSEDCL. </w:t>
       </w:r>
     </w:p>
     <w:p>
@@ -1112,11 +1217,8 @@
         <w:ind w:right="14" w:hanging="576"/>
       </w:pPr>
       <w:r>
-        <w:t xml:space="preserve">The existing metering System, if not in accordance with the Grid Interactive Renewable Regulations, shall be replaced by a bi-directional meter (whole current/CT operated) and a </w:t>
-      </w:r>
-      <w:r>
         <w:lastRenderedPageBreak/>
-        <w:t xml:space="preserve">separate Renewable Energy Generation Meter shall be provided to measure Renewable Energy generation. The bi-directional meter (whole current/CT operated) shall be installed at the inter-connection point to MSEDCL’s Network for recording export and import of energy. </w:t>
+        <w:t xml:space="preserve">The existing metering System, if not in accordance with the Grid Interactive Renewable Regulations, shall be replaced by a bi-directional meter (whole current/CT operated) and a separate Renewable Energy Generation Meter shall be provided to measure Renewable Energy generation. The bi-directional meter (whole current/CT operated) shall be installed at the inter-connection point to MSEDCL’s Network for recording export and import of energy. </w:t>
       </w:r>
     </w:p>
     <w:p>
@@ -1138,7 +1240,15 @@
         <w:ind w:right="14" w:hanging="576"/>
       </w:pPr>
       <w:r>
-        <w:t xml:space="preserve">The uni-directional and bi-directional meters shall be fixed in separate meter boxes in the same proximity. </w:t>
+        <w:t xml:space="preserve">The </w:t>
+      </w:r>
+      <w:proofErr w:type="spellStart"/>
+      <w:r>
+        <w:t>uni</w:t>
+      </w:r>
+      <w:proofErr w:type="spellEnd"/>
+      <w:r>
+        <w:t xml:space="preserve">-directional and bi-directional meters shall be fixed in separate meter boxes in the same proximity. </w:t>
       </w:r>
     </w:p>
     <w:p>
@@ -1235,7 +1345,15 @@
         <w:ind w:right="14" w:hanging="360"/>
       </w:pPr>
       <w:r>
-        <w:t xml:space="preserve">In case the Eligible Consumer is within the ambit of Time of Day (ToD) tariff, the electricity consumption in any time block, i.e. peak hours, off-peak hours, etc., shall be first compensated with the quantum of electricity injected in the same time block; any excess injection over and above the consumption in any other time block in a Billing Cycle shall be accounted as if the excess injection had occurred during off- peak hours; </w:t>
+        <w:t>In case the Eligible Consumer is within the ambit of Time of Day (</w:t>
+      </w:r>
+      <w:proofErr w:type="spellStart"/>
+      <w:r>
+        <w:t>ToD</w:t>
+      </w:r>
+      <w:proofErr w:type="spellEnd"/>
+      <w:r>
+        <w:t xml:space="preserve">) tariff, the electricity consumption in any time block, i.e. peak hours, off-peak hours, etc., shall be first compensated with the quantum of electricity injected in the same time block; any excess injection over and above the consumption in any other time block in a Billing Cycle shall be accounted as if the excess injection had occurred during off- peak hours; </w:t>
       </w:r>
     </w:p>
     <w:p>
@@ -1247,7 +1365,23 @@
         <w:ind w:right="14" w:hanging="360"/>
       </w:pPr>
       <w:r>
-        <w:t xml:space="preserve">MSEDCL shall compute the amount  payable  to  the  Eligible Consumer for the excess Renewable Energy purchased by it as specified in Clause 8.5 (c), and shall provide credit equivalent to the amount payable in the immediately succeeding Billing Cycle. </w:t>
+        <w:t xml:space="preserve">MSEDCL shall compute the </w:t>
+      </w:r>
+      <w:proofErr w:type="gramStart"/>
+      <w:r>
+        <w:t>amount  payable</w:t>
+      </w:r>
+      <w:proofErr w:type="gramEnd"/>
+      <w:r>
+        <w:t xml:space="preserve">  </w:t>
+      </w:r>
+      <w:proofErr w:type="gramStart"/>
+      <w:r>
+        <w:t>to  the</w:t>
+      </w:r>
+      <w:proofErr w:type="gramEnd"/>
+      <w:r>
+        <w:t xml:space="preserve">  Eligible Consumer for the excess Renewable Energy purchased by it as specified in Clause 8.5 (c), and shall provide credit equivalent to the amount payable in the immediately succeeding Billing Cycle. </w:t>
       </w:r>
     </w:p>
     <w:p>
@@ -1354,99 +1488,57 @@
         <w:ind w:right="14" w:hanging="576"/>
       </w:pPr>
       <w:r>
+        <w:lastRenderedPageBreak/>
         <w:t xml:space="preserve">Any dispute arising under this Agreement shall be resolved promptly, in good faith and in an equitable manner by both the Parties. </w:t>
       </w:r>
     </w:p>
     <w:p>
       <w:pPr>
-        <w:spacing w:after="0" w:line="259" w:lineRule="auto"/>
-        <w:ind w:left="0" w:firstLine="0"/>
-        <w:jc w:val="left"/>
-      </w:pPr>
-      <w:r>
-        <w:t xml:space="preserve"> </w:t>
-      </w:r>
-    </w:p>
-    <w:p>
-      <w:pPr>
-        <w:spacing w:after="0" w:line="259" w:lineRule="auto"/>
-        <w:ind w:left="0" w:firstLine="0"/>
-        <w:jc w:val="left"/>
-      </w:pPr>
-    </w:p>
-    <w:p>
-      <w:pPr>
-        <w:spacing w:after="0" w:line="259" w:lineRule="auto"/>
-        <w:ind w:left="0" w:firstLine="0"/>
-        <w:jc w:val="left"/>
-      </w:pPr>
-    </w:p>
-    <w:p>
-      <w:pPr>
-        <w:spacing w:after="0" w:line="259" w:lineRule="auto"/>
-        <w:ind w:left="0" w:firstLine="0"/>
-        <w:jc w:val="left"/>
-      </w:pPr>
-    </w:p>
-    <w:p>
-      <w:pPr>
-        <w:spacing w:after="0" w:line="259" w:lineRule="auto"/>
-        <w:ind w:left="0" w:firstLine="0"/>
-        <w:jc w:val="left"/>
-      </w:pPr>
-    </w:p>
-    <w:p>
-      <w:pPr>
-        <w:spacing w:after="0" w:line="259" w:lineRule="auto"/>
-        <w:ind w:left="0" w:firstLine="0"/>
-        <w:jc w:val="left"/>
-      </w:pPr>
-    </w:p>
-    <w:p>
-      <w:pPr>
-        <w:spacing w:after="0" w:line="259" w:lineRule="auto"/>
-        <w:ind w:left="0" w:firstLine="0"/>
-        <w:jc w:val="left"/>
-      </w:pPr>
-    </w:p>
-    <w:p>
-      <w:pPr>
-        <w:spacing w:after="0" w:line="259" w:lineRule="auto"/>
-        <w:ind w:left="0" w:firstLine="0"/>
-        <w:jc w:val="left"/>
-      </w:pPr>
-    </w:p>
-    <w:p>
-      <w:pPr>
-        <w:spacing w:after="0" w:line="259" w:lineRule="auto"/>
-        <w:ind w:left="0" w:firstLine="0"/>
-        <w:jc w:val="left"/>
-      </w:pPr>
-    </w:p>
-    <w:p>
-      <w:pPr>
-        <w:spacing w:after="0" w:line="259" w:lineRule="auto"/>
-        <w:ind w:left="0" w:firstLine="0"/>
-        <w:jc w:val="left"/>
-      </w:pPr>
-    </w:p>
-    <w:p>
-      <w:pPr>
-        <w:spacing w:after="0" w:line="259" w:lineRule="auto"/>
-        <w:ind w:left="0" w:firstLine="0"/>
-        <w:jc w:val="left"/>
-      </w:pPr>
-    </w:p>
-    <w:p>
-      <w:pPr>
         <w:numPr>
           <w:ilvl w:val="1"/>
           <w:numId w:val="1"/>
         </w:numPr>
         <w:ind w:right="14" w:hanging="576"/>
       </w:pPr>
-      <w:r>
-        <w:t xml:space="preserve">The  Eligible  Consumer  shall  have  recourse  to  the  concerned  Consumer  Grievance Redressal Forum constituted under the relevant Regulations in respect of any grievance regarding billing, which has not been redressed by MSEDCL. </w:t>
+      <w:proofErr w:type="gramStart"/>
+      <w:r>
+        <w:t>The  Eligible</w:t>
+      </w:r>
+      <w:proofErr w:type="gramEnd"/>
+      <w:r>
+        <w:t xml:space="preserve">  </w:t>
+      </w:r>
+      <w:proofErr w:type="gramStart"/>
+      <w:r>
+        <w:t>Consumer  shall</w:t>
+      </w:r>
+      <w:proofErr w:type="gramEnd"/>
+      <w:r>
+        <w:t xml:space="preserve">  </w:t>
+      </w:r>
+      <w:proofErr w:type="gramStart"/>
+      <w:r>
+        <w:t>have  recourse</w:t>
+      </w:r>
+      <w:proofErr w:type="gramEnd"/>
+      <w:r>
+        <w:t xml:space="preserve">  </w:t>
+      </w:r>
+      <w:proofErr w:type="gramStart"/>
+      <w:r>
+        <w:t>to  the</w:t>
+      </w:r>
+      <w:proofErr w:type="gramEnd"/>
+      <w:r>
+        <w:t xml:space="preserve">  </w:t>
+      </w:r>
+      <w:proofErr w:type="gramStart"/>
+      <w:r>
+        <w:t>concerned  Consumer</w:t>
+      </w:r>
+      <w:proofErr w:type="gramEnd"/>
+      <w:r>
+        <w:t xml:space="preserve">  Grievance Redressal Forum constituted under the relevant Regulations in respect of any grievance regarding billing, which has not been redressed by MSEDCL. </w:t>
       </w:r>
     </w:p>
     <w:p>
@@ -1469,7 +1561,11 @@
         <w:jc w:val="left"/>
       </w:pPr>
       <w:r>
-        <w:t xml:space="preserve">In the witness, where of  </w:t>
+        <w:t xml:space="preserve">In the witness, where </w:t>
+      </w:r>
+      <w:proofErr w:type="gramStart"/>
+      <w:r>
+        <w:t xml:space="preserve">of  </w:t>
       </w:r>
       <w:r>
         <w:rPr>
@@ -1477,23 +1573,25 @@
           <w:bCs/>
           <w:u w:val="single"/>
         </w:rPr>
-        <w:t>__</w:t>
-      </w:r>
+        <w:t>_</w:t>
+      </w:r>
+      <w:proofErr w:type="gramEnd"/>
       <w:r>
         <w:rPr>
           <w:b/>
           <w:bCs/>
           <w:u w:val="single"/>
         </w:rPr>
-        <w:t>MITALI</w:t>
-      </w:r>
+        <w:t>_</w:t>
+      </w:r>
+      <w:proofErr w:type="gramStart"/>
       <w:r>
         <w:rPr>
           <w:b/>
           <w:bCs/>
           <w:u w:val="single"/>
         </w:rPr>
-        <w:t xml:space="preserve"> </w:t>
+        <w:t>MITALI</w:t>
       </w:r>
       <w:r>
         <w:rPr>
@@ -1501,7 +1599,7 @@
           <w:bCs/>
           <w:u w:val="single"/>
         </w:rPr>
-        <w:t xml:space="preserve"> ENTERPRISES</w:t>
+        <w:t xml:space="preserve"> </w:t>
       </w:r>
       <w:r>
         <w:rPr>
@@ -1509,22 +1607,60 @@
           <w:bCs/>
           <w:u w:val="single"/>
         </w:rPr>
+        <w:t xml:space="preserve"> </w:t>
+      </w:r>
+      <w:proofErr w:type="spellStart"/>
+      <w:r>
+        <w:rPr>
+          <w:b/>
+          <w:bCs/>
+          <w:u w:val="single"/>
+        </w:rPr>
+        <w:t>ENTERPRISES</w:t>
+      </w:r>
+      <w:proofErr w:type="gramEnd"/>
+      <w:r>
+        <w:rPr>
+          <w:b/>
+          <w:bCs/>
+          <w:u w:val="single"/>
+        </w:rPr>
         <w:t>__</w:t>
       </w:r>
       <w:r>
-        <w:t xml:space="preserve">for and on behalf of Eligible Consumer) and </w:t>
-      </w:r>
-      <w:r>
-        <w:t>{{consumer_name}}</w:t>
-      </w:r>
-      <w:r>
-        <w:t xml:space="preserve"> </w:t>
-      </w:r>
-      <w:r>
-        <w:t xml:space="preserve">for and on behalf of </w:t>
-      </w:r>
-      <w:r>
-        <w:t xml:space="preserve"> MSEDCL, agree to this agreement.</w:t>
+        <w:t>for</w:t>
+      </w:r>
+      <w:proofErr w:type="spellEnd"/>
+      <w:r>
+        <w:t xml:space="preserve"> and on behalf of Eligible Consumer) and </w:t>
+      </w:r>
+      <w:r>
+        <w:t>{{</w:t>
+      </w:r>
+      <w:proofErr w:type="spellStart"/>
+      <w:r>
+        <w:t>consumer_name</w:t>
+      </w:r>
+      <w:proofErr w:type="spellEnd"/>
+      <w:r>
+        <w:t>}}</w:t>
+      </w:r>
+      <w:r>
+        <w:t xml:space="preserve"> </w:t>
+      </w:r>
+      <w:r>
+        <w:t xml:space="preserve">for and on behalf </w:t>
+      </w:r>
+      <w:proofErr w:type="gramStart"/>
+      <w:r>
+        <w:t xml:space="preserve">of </w:t>
+      </w:r>
+      <w:r>
+        <w:t xml:space="preserve"> MSEDCL</w:t>
+      </w:r>
+      <w:proofErr w:type="gramEnd"/>
+      <w:r>
+        <w:t>, agree to this agreement.</w:t>
       </w:r>
     </w:p>
     <w:p>
@@ -1565,7 +1701,15 @@
         <w:t xml:space="preserve">                 </w:t>
       </w:r>
       <w:r>
-        <w:t>{%consumer_signature}</w:t>
+        <w:t>{%</w:t>
+      </w:r>
+      <w:proofErr w:type="spellStart"/>
+      <w:r>
+        <w:t>consumer_signature</w:t>
+      </w:r>
+      <w:proofErr w:type="spellEnd"/>
+      <w:r>
+        <w:t>}</w:t>
       </w:r>
     </w:p>
     <w:p>
@@ -1598,7 +1742,15 @@
         <w:t xml:space="preserve">                    </w:t>
       </w:r>
       <w:r>
-        <w:t>{{consumer_name}}</w:t>
+        <w:t>{{</w:t>
+      </w:r>
+      <w:proofErr w:type="spellStart"/>
+      <w:r>
+        <w:t>consumer_name</w:t>
+      </w:r>
+      <w:proofErr w:type="spellEnd"/>
+      <w:r>
+        <w:t>}}</w:t>
       </w:r>
     </w:p>
     <w:p>
@@ -1611,7 +1763,7 @@
     <w:p>
       <w:pPr>
         <w:spacing w:after="0" w:line="276" w:lineRule="auto"/>
-        <w:ind w:left="355" w:hanging="10"/>
+        <w:ind w:left="0" w:firstLine="0"/>
         <w:jc w:val="left"/>
       </w:pPr>
     </w:p>
@@ -1628,26 +1780,9 @@
         <w:ind w:left="355" w:hanging="10"/>
         <w:jc w:val="left"/>
       </w:pPr>
-    </w:p>
-    <w:p>
-      <w:pPr>
-        <w:spacing w:after="0" w:line="276" w:lineRule="auto"/>
-        <w:ind w:left="355" w:hanging="10"/>
-        <w:jc w:val="left"/>
-      </w:pPr>
-    </w:p>
-    <w:p>
-      <w:pPr>
-        <w:spacing w:after="0" w:line="276" w:lineRule="auto"/>
-        <w:ind w:left="355" w:hanging="10"/>
-        <w:jc w:val="left"/>
-      </w:pPr>
       <w:r>
         <w:t xml:space="preserve">              </w:t>
       </w:r>
-      <w:r>
-        <w:t>{%vendor_signature}</w:t>
-      </w:r>
     </w:p>
     <w:p>
       <w:pPr>
@@ -1656,7 +1791,24 @@
         <w:jc w:val="left"/>
       </w:pPr>
       <w:r>
-        <w:t xml:space="preserve"> </w:t>
+        <w:t xml:space="preserve">            </w:t>
+      </w:r>
+      <w:r>
+        <w:t xml:space="preserve"> </w:t>
+      </w:r>
+      <w:r>
+        <w:t>{%</w:t>
+      </w:r>
+      <w:proofErr w:type="spellStart"/>
+      <w:r>
+        <w:t>vendor_signature</w:t>
+      </w:r>
+      <w:proofErr w:type="spellEnd"/>
+      <w:r>
+        <w:t>}</w:t>
+      </w:r>
+      <w:r>
+        <w:t xml:space="preserve">                                                      </w:t>
       </w:r>
     </w:p>
     <w:p>
@@ -1668,7 +1820,7 @@
         <w:t xml:space="preserve">______________________________ </w:t>
       </w:r>
       <w:r>
-        <w:t xml:space="preserve">                             ______________________________ </w:t>
+        <w:t xml:space="preserve">                             </w:t>
       </w:r>
     </w:p>
     <w:p>
@@ -1683,7 +1835,7 @@
         <w:ind w:left="345" w:right="14" w:firstLine="0"/>
       </w:pPr>
       <w:r>
-        <w:t xml:space="preserve">            Witness 1 (Vendor)                                                                     Witness 2 (Vendor) </w:t>
+        <w:t xml:space="preserve">            Witness 1 (Vendor)                                                                     </w:t>
       </w:r>
     </w:p>
     <w:p>
@@ -1692,13 +1844,134 @@
         <w:ind w:left="345" w:right="14" w:firstLine="0"/>
       </w:pPr>
     </w:p>
+    <w:p>
+      <w:pPr>
+        <w:spacing w:line="259" w:lineRule="auto"/>
+        <w:ind w:left="345" w:right="14" w:firstLine="0"/>
+      </w:pPr>
+    </w:p>
+    <w:p>
+      <w:pPr>
+        <w:spacing w:line="259" w:lineRule="auto"/>
+        <w:ind w:left="345" w:right="14" w:firstLine="0"/>
+      </w:pPr>
+    </w:p>
+    <w:p>
+      <w:pPr>
+        <w:spacing w:line="259" w:lineRule="auto"/>
+        <w:ind w:left="0" w:right="14" w:firstLine="0"/>
+      </w:pPr>
+    </w:p>
+    <w:p>
+      <w:pPr>
+        <w:spacing w:line="259" w:lineRule="auto"/>
+        <w:ind w:left="345" w:right="14" w:firstLine="0"/>
+      </w:pPr>
+    </w:p>
+    <w:p>
+      <w:pPr>
+        <w:spacing w:line="259" w:lineRule="auto"/>
+        <w:ind w:left="345" w:right="14" w:firstLine="0"/>
+      </w:pPr>
+      <w:r>
+        <w:rPr>
+          <w:b/>
+          <w:bCs/>
+        </w:rPr>
+        <w:t xml:space="preserve">       </w:t>
+      </w:r>
+      <w:r>
+        <w:rPr>
+          <w:b/>
+          <w:bCs/>
+        </w:rPr>
+        <w:t>{%witness2_signature}</w:t>
+      </w:r>
+    </w:p>
+    <w:p>
+      <w:r>
+        <w:t>______________________________</w:t>
+      </w:r>
+    </w:p>
+    <w:p>
+      <w:pPr>
+        <w:spacing w:line="259" w:lineRule="auto"/>
+        <w:ind w:left="0" w:right="14" w:firstLine="0"/>
+      </w:pPr>
+    </w:p>
+    <w:p>
+      <w:pPr>
+        <w:spacing w:line="259" w:lineRule="auto"/>
+        <w:ind w:left="345" w:right="14" w:firstLine="0"/>
+      </w:pPr>
+      <w:r>
+        <w:t xml:space="preserve">           Witness 2 (Vendor)</w:t>
+      </w:r>
+    </w:p>
+    <w:p>
+      <w:pPr>
+        <w:spacing w:line="259" w:lineRule="auto"/>
+        <w:ind w:left="345" w:right="14" w:firstLine="0"/>
+      </w:pPr>
+    </w:p>
     <w:sectPr>
-      <w:pgSz w:w="11921" w:h="16841"/>
-      <w:pgMar w:top="0" w:right="1234" w:bottom="1297" w:left="1080" w:header="720" w:footer="720" w:gutter="0"/>
+      <w:pgSz w:w="11907" w:h="16840" w:code="9"/>
+      <w:pgMar w:top="567" w:right="1236" w:bottom="1298" w:left="1077" w:header="794" w:footer="851" w:gutter="0"/>
       <w:cols w:space="720"/>
+      <w:docGrid w:linePitch="326"/>
     </w:sectPr>
   </w:body>
 </w:document>
+</file>
+
+<file path=word/endnotes.xml><?xml version="1.0" encoding="utf-8"?>
+<w:endnotes xmlns:wpc="http://schemas.microsoft.com/office/word/2010/wordprocessingCanvas" xmlns:cx="http://schemas.microsoft.com/office/drawing/2014/chartex" xmlns:cx1="http://schemas.microsoft.com/office/drawing/2015/9/8/chartex" xmlns:cx2="http://schemas.microsoft.com/office/drawing/2015/10/21/chartex" xmlns:cx3="http://schemas.microsoft.com/office/drawing/2016/5/9/chartex" xmlns:cx4="http://schemas.microsoft.com/office/drawing/2016/5/10/chartex" xmlns:cx5="http://schemas.microsoft.com/office/drawing/2016/5/11/chartex" xmlns:cx6="http://schemas.microsoft.com/office/drawing/2016/5/12/chartex" xmlns:cx7="http://schemas.microsoft.com/office/drawing/2016/5/13/chartex" xmlns:cx8="http://schemas.microsoft.com/office/drawing/2016/5/14/chartex" xmlns:mc="http://schemas.openxmlformats.org/markup-compatibility/2006" xmlns:aink="http://schemas.microsoft.com/office/drawing/2016/ink" xmlns:am3d="http://schemas.microsoft.com/office/drawing/2017/model3d" xmlns:o="urn:schemas-microsoft-com:office:office" xmlns:oel="http://schemas.microsoft.com/office/2019/extlst" xmlns:r="http://schemas.openxmlformats.org/officeDocument/2006/relationships" xmlns:m="http://schemas.openxmlformats.org/officeDocument/2006/math" xmlns:v="urn:schemas-microsoft-com:vml" xmlns:wp14="http://schemas.microsoft.com/office/word/2010/wordprocessingDrawing" xmlns:wp="http://schemas.openxmlformats.org/drawingml/2006/wordprocessingDrawing" xmlns:w10="urn:schemas-microsoft-com:office:word" xmlns:w="http://schemas.openxmlformats.org/wordprocessingml/2006/main" xmlns:w14="http://schemas.microsoft.com/office/word/2010/wordml" xmlns:w15="http://schemas.microsoft.com/office/word/2012/wordml" xmlns:w16cex="http://schemas.microsoft.com/office/word/2018/wordml/cex" xmlns:w16cid="http://schemas.microsoft.com/office/word/2016/wordml/cid" xmlns:w16="http://schemas.microsoft.com/office/word/2018/wordml" xmlns:w16du="http://schemas.microsoft.com/office/word/2023/wordml/word16du" xmlns:w16sdtdh="http://schemas.microsoft.com/office/word/2020/wordml/sdtdatahash" xmlns:w16sdtfl="http://schemas.microsoft.com/office/word/2024/wordml/sdtformatlock" xmlns:w16se="http://schemas.microsoft.com/office/word/2015/wordml/symex" xmlns:wpg="http://schemas.microsoft.com/office/word/2010/wordprocessingGroup" xmlns:wpi="http://schemas.microsoft.com/office/word/2010/wordprocessingInk" xmlns:wne="http://schemas.microsoft.com/office/word/2006/wordml" xmlns:wps="http://schemas.microsoft.com/office/word/2010/wordprocessingShape" mc:Ignorable="w14 w15 w16se w16cid w16 w16cex w16sdtdh w16sdtfl w16du wp14">
+  <w:endnote w:type="separator" w:id="-1">
+    <w:p>
+      <w:pPr>
+        <w:spacing w:after="0" w:line="240" w:lineRule="auto"/>
+      </w:pPr>
+      <w:r>
+        <w:separator/>
+      </w:r>
+    </w:p>
+  </w:endnote>
+  <w:endnote w:type="continuationSeparator" w:id="0">
+    <w:p>
+      <w:pPr>
+        <w:spacing w:after="0" w:line="240" w:lineRule="auto"/>
+      </w:pPr>
+      <w:r>
+        <w:continuationSeparator/>
+      </w:r>
+    </w:p>
+  </w:endnote>
+</w:endnotes>
+</file>
+
+<file path=word/footnotes.xml><?xml version="1.0" encoding="utf-8"?>
+<w:footnotes xmlns:wpc="http://schemas.microsoft.com/office/word/2010/wordprocessingCanvas" xmlns:cx="http://schemas.microsoft.com/office/drawing/2014/chartex" xmlns:cx1="http://schemas.microsoft.com/office/drawing/2015/9/8/chartex" xmlns:cx2="http://schemas.microsoft.com/office/drawing/2015/10/21/chartex" xmlns:cx3="http://schemas.microsoft.com/office/drawing/2016/5/9/chartex" xmlns:cx4="http://schemas.microsoft.com/office/drawing/2016/5/10/chartex" xmlns:cx5="http://schemas.microsoft.com/office/drawing/2016/5/11/chartex" xmlns:cx6="http://schemas.microsoft.com/office/drawing/2016/5/12/chartex" xmlns:cx7="http://schemas.microsoft.com/office/drawing/2016/5/13/chartex" xmlns:cx8="http://schemas.microsoft.com/office/drawing/2016/5/14/chartex" xmlns:mc="http://schemas.openxmlformats.org/markup-compatibility/2006" xmlns:aink="http://schemas.microsoft.com/office/drawing/2016/ink" xmlns:am3d="http://schemas.microsoft.com/office/drawing/2017/model3d" xmlns:o="urn:schemas-microsoft-com:office:office" xmlns:oel="http://schemas.microsoft.com/office/2019/extlst" xmlns:r="http://schemas.openxmlformats.org/officeDocument/2006/relationships" xmlns:m="http://schemas.openxmlformats.org/officeDocument/2006/math" xmlns:v="urn:schemas-microsoft-com:vml" xmlns:wp14="http://schemas.microsoft.com/office/word/2010/wordprocessingDrawing" xmlns:wp="http://schemas.openxmlformats.org/drawingml/2006/wordprocessingDrawing" xmlns:w10="urn:schemas-microsoft-com:office:word" xmlns:w="http://schemas.openxmlformats.org/wordprocessingml/2006/main" xmlns:w14="http://schemas.microsoft.com/office/word/2010/wordml" xmlns:w15="http://schemas.microsoft.com/office/word/2012/wordml" xmlns:w16cex="http://schemas.microsoft.com/office/word/2018/wordml/cex" xmlns:w16cid="http://schemas.microsoft.com/office/word/2016/wordml/cid" xmlns:w16="http://schemas.microsoft.com/office/word/2018/wordml" xmlns:w16du="http://schemas.microsoft.com/office/word/2023/wordml/word16du" xmlns:w16sdtdh="http://schemas.microsoft.com/office/word/2020/wordml/sdtdatahash" xmlns:w16sdtfl="http://schemas.microsoft.com/office/word/2024/wordml/sdtformatlock" xmlns:w16se="http://schemas.microsoft.com/office/word/2015/wordml/symex" xmlns:wpg="http://schemas.microsoft.com/office/word/2010/wordprocessingGroup" xmlns:wpi="http://schemas.microsoft.com/office/word/2010/wordprocessingInk" xmlns:wne="http://schemas.microsoft.com/office/word/2006/wordml" xmlns:wps="http://schemas.microsoft.com/office/word/2010/wordprocessingShape" mc:Ignorable="w14 w15 w16se w16cid w16 w16cex w16sdtdh w16sdtfl w16du wp14">
+  <w:footnote w:type="separator" w:id="-1">
+    <w:p>
+      <w:pPr>
+        <w:spacing w:after="0" w:line="240" w:lineRule="auto"/>
+      </w:pPr>
+      <w:r>
+        <w:separator/>
+      </w:r>
+    </w:p>
+  </w:footnote>
+  <w:footnote w:type="continuationSeparator" w:id="0">
+    <w:p>
+      <w:pPr>
+        <w:spacing w:after="0" w:line="240" w:lineRule="auto"/>
+      </w:pPr>
+      <w:r>
+        <w:continuationSeparator/>
+      </w:r>
+    </w:p>
+  </w:footnote>
+</w:footnotes>
 </file>
 
 <file path=word/numbering.xml><?xml version="1.0" encoding="utf-8"?>
@@ -2574,6 +2847,58 @@
     <w:semiHidden/>
     <w:unhideWhenUsed/>
   </w:style>
+  <w:style w:type="paragraph" w:styleId="Header">
+    <w:name w:val="header"/>
+    <w:basedOn w:val="Normal"/>
+    <w:link w:val="HeaderChar"/>
+    <w:uiPriority w:val="99"/>
+    <w:unhideWhenUsed/>
+    <w:rsid w:val="00966B0A"/>
+    <w:pPr>
+      <w:tabs>
+        <w:tab w:val="center" w:pos="4513"/>
+        <w:tab w:val="right" w:pos="9026"/>
+      </w:tabs>
+      <w:spacing w:after="0" w:line="240" w:lineRule="auto"/>
+    </w:pPr>
+  </w:style>
+  <w:style w:type="character" w:customStyle="1" w:styleId="HeaderChar">
+    <w:name w:val="Header Char"/>
+    <w:basedOn w:val="DefaultParagraphFont"/>
+    <w:link w:val="Header"/>
+    <w:uiPriority w:val="99"/>
+    <w:rsid w:val="00966B0A"/>
+    <w:rPr>
+      <w:rFonts w:ascii="Times New Roman" w:eastAsia="Times New Roman" w:hAnsi="Times New Roman" w:cs="Times New Roman"/>
+      <w:color w:val="000000"/>
+    </w:rPr>
+  </w:style>
+  <w:style w:type="paragraph" w:styleId="Footer">
+    <w:name w:val="footer"/>
+    <w:basedOn w:val="Normal"/>
+    <w:link w:val="FooterChar"/>
+    <w:uiPriority w:val="99"/>
+    <w:unhideWhenUsed/>
+    <w:rsid w:val="00966B0A"/>
+    <w:pPr>
+      <w:tabs>
+        <w:tab w:val="center" w:pos="4513"/>
+        <w:tab w:val="right" w:pos="9026"/>
+      </w:tabs>
+      <w:spacing w:after="0" w:line="240" w:lineRule="auto"/>
+    </w:pPr>
+  </w:style>
+  <w:style w:type="character" w:customStyle="1" w:styleId="FooterChar">
+    <w:name w:val="Footer Char"/>
+    <w:basedOn w:val="DefaultParagraphFont"/>
+    <w:link w:val="Footer"/>
+    <w:uiPriority w:val="99"/>
+    <w:rsid w:val="00966B0A"/>
+    <w:rPr>
+      <w:rFonts w:ascii="Times New Roman" w:eastAsia="Times New Roman" w:hAnsi="Times New Roman" w:cs="Times New Roman"/>
+      <w:color w:val="000000"/>
+    </w:rPr>
+  </w:style>
 </w:styles>
 </file>
 

</xml_diff>